<commit_message>
Update dist with new data
</commit_message>
<xml_diff>
--- a/data/critical_paths/Percorso critico 3.docx
+++ b/data/critical_paths/Percorso critico 3.docx
@@ -69,100 +69,112 @@
           <w:rStyle w:val="apple-converted-space"/>
           <w:rFonts w:eastAsia="" w:ascii="Garamond" w:hAnsi="Garamond" w:eastAsiaTheme="majorEastAsia"/>
           <w:color w:val="000000"/>
+          <w:shd w:fill="auto" w:val="clear"/>
         </w:rPr>
         <w:t> </w:t>
       </w:r>
-      <w:r>
-        <w:rPr>
-          <w:rStyle w:val="Emphasis"/>
-          <w:rFonts w:eastAsia="" w:ascii="Garamond" w:hAnsi="Garamond" w:eastAsiaTheme="majorEastAsia"/>
-          <w:color w:val="000000"/>
-          <w:highlight w:val="yellow"/>
-        </w:rPr>
-        <w:t>Storie Naturali</w:t>
-      </w:r>
-      <w:r>
-        <w:rPr>
-          <w:rStyle w:val="apple-converted-space"/>
-          <w:rFonts w:eastAsia="" w:ascii="Garamond" w:hAnsi="Garamond" w:eastAsiaTheme="majorEastAsia"/>
-          <w:color w:val="000000"/>
-          <w:highlight w:val="yellow"/>
-        </w:rPr>
-        <w:t> </w:t>
-      </w:r>
-      <w:r>
-        <w:rPr>
-          <w:rFonts w:ascii="Garamond" w:hAnsi="Garamond"/>
-          <w:color w:val="000000"/>
-          <w:highlight w:val="yellow"/>
-        </w:rPr>
-        <w:t>(1966)</w:t>
-      </w:r>
-      <w:r>
-        <w:rPr>
-          <w:rFonts w:ascii="Garamond" w:hAnsi="Garamond"/>
-          <w:color w:val="000000"/>
-        </w:rPr>
-        <w:t xml:space="preserve"> e</w:t>
-      </w:r>
-      <w:r>
-        <w:rPr>
-          <w:rStyle w:val="apple-converted-space"/>
-          <w:rFonts w:eastAsia="" w:ascii="Garamond" w:hAnsi="Garamond" w:eastAsiaTheme="majorEastAsia"/>
-          <w:color w:val="000000"/>
-        </w:rPr>
-        <w:t> </w:t>
-      </w:r>
-      <w:r>
-        <w:rPr>
-          <w:rStyle w:val="Emphasis"/>
-          <w:rFonts w:eastAsia="" w:ascii="Garamond" w:hAnsi="Garamond" w:eastAsiaTheme="majorEastAsia"/>
-          <w:color w:val="000000"/>
-          <w:highlight w:val="yellow"/>
-        </w:rPr>
-        <w:t>Vizio di forma</w:t>
-      </w:r>
-      <w:r>
-        <w:rPr>
-          <w:rStyle w:val="apple-converted-space"/>
-          <w:rFonts w:eastAsia="" w:ascii="Garamond" w:hAnsi="Garamond" w:eastAsiaTheme="majorEastAsia"/>
-          <w:color w:val="000000"/>
-          <w:highlight w:val="yellow"/>
-        </w:rPr>
-        <w:t> </w:t>
-      </w:r>
-      <w:r>
-        <w:rPr>
-          <w:rFonts w:ascii="Garamond" w:hAnsi="Garamond"/>
-          <w:color w:val="000000"/>
-          <w:highlight w:val="yellow"/>
-        </w:rPr>
-        <w:t xml:space="preserve">(1971) </w:t>
-      </w:r>
-      <w:r>
-        <w:rPr>
-          <w:rFonts w:ascii="Garamond" w:hAnsi="Garamond"/>
-          <w:b/>
-          <w:bCs/>
-          <w:color w:val="000000"/>
-          <w:highlight w:val="yellow"/>
-        </w:rPr>
-        <w:t>(di cui l’atlante raccogli XYX)</w:t>
-      </w:r>
-      <w:r>
-        <w:rPr>
-          <w:rFonts w:ascii="Garamond" w:hAnsi="Garamond"/>
-          <w:color w:val="000000"/>
-          <w:highlight w:val="yellow"/>
-        </w:rPr>
-        <w:t>,</w:t>
-      </w:r>
-      <w:r>
-        <w:rPr>
-          <w:rFonts w:ascii="Garamond" w:hAnsi="Garamond"/>
-          <w:color w:val="000000"/>
-        </w:rPr>
-        <w:t xml:space="preserve"> la critica ha parlato di distopia tecnologica, di eco-distopia, di libri ecologici</w:t>
+      <w:hyperlink r:id="rId3">
+        <w:r>
+          <w:rPr>
+            <w:rStyle w:val="Hyperlink"/>
+            <w:rFonts w:eastAsia="" w:ascii="Garamond" w:hAnsi="Garamond" w:eastAsiaTheme="majorEastAsia"/>
+            <w:i/>
+            <w:i/>
+            <w:iCs/>
+            <w:color w:val="000000"/>
+            <w:shd w:fill="auto" w:val="clear"/>
+          </w:rPr>
+          <w:t>Storie Naturali</w:t>
+        </w:r>
+        <w:r>
+          <w:rPr>
+            <w:rStyle w:val="Hyperlink"/>
+            <w:rFonts w:eastAsia="" w:ascii="Garamond" w:hAnsi="Garamond" w:eastAsiaTheme="majorEastAsia"/>
+            <w:color w:val="000000"/>
+            <w:shd w:fill="auto" w:val="clear"/>
+          </w:rPr>
+          <w:t> </w:t>
+        </w:r>
+        <w:r>
+          <w:rPr>
+            <w:rStyle w:val="Hyperlink"/>
+            <w:rFonts w:ascii="Garamond" w:hAnsi="Garamond"/>
+            <w:color w:val="000000"/>
+            <w:shd w:fill="auto" w:val="clear"/>
+          </w:rPr>
+          <w:t>(1966)</w:t>
+        </w:r>
+        <w:r>
+          <w:rPr>
+            <w:rStyle w:val="Hyperlink"/>
+            <w:rFonts w:eastAsia="" w:ascii="Garamond" w:hAnsi="Garamond" w:eastAsiaTheme="majorEastAsia"/>
+            <w:color w:val="000000"/>
+            <w:shd w:fill="auto" w:val="clear"/>
+          </w:rPr>
+          <w:t xml:space="preserve"> </w:t>
+        </w:r>
+        <w:r>
+          <w:rPr>
+            <w:rStyle w:val="Hyperlink"/>
+            <w:rFonts w:eastAsia="" w:ascii="Garamond" w:hAnsi="Garamond" w:eastAsiaTheme="majorEastAsia"/>
+            <w:color w:val="000000"/>
+            <w:shd w:fill="auto" w:val="clear"/>
+          </w:rPr>
+          <w:t xml:space="preserve">e </w:t>
+        </w:r>
+        <w:r>
+          <w:rPr>
+            <w:rStyle w:val="Hyperlink"/>
+            <w:rFonts w:eastAsia="" w:ascii="Garamond" w:hAnsi="Garamond" w:eastAsiaTheme="majorEastAsia"/>
+            <w:i/>
+            <w:i/>
+            <w:iCs/>
+            <w:color w:val="000000"/>
+            <w:shd w:fill="auto" w:val="clear"/>
+          </w:rPr>
+          <w:t>Vizio di forma</w:t>
+        </w:r>
+        <w:r>
+          <w:rPr>
+            <w:rStyle w:val="Hyperlink"/>
+            <w:rFonts w:eastAsia="" w:ascii="Garamond" w:hAnsi="Garamond" w:eastAsiaTheme="majorEastAsia"/>
+            <w:color w:val="000000"/>
+            <w:shd w:fill="auto" w:val="clear"/>
+          </w:rPr>
+          <w:t> </w:t>
+        </w:r>
+        <w:r>
+          <w:rPr>
+            <w:rStyle w:val="Hyperlink"/>
+            <w:rFonts w:ascii="Garamond" w:hAnsi="Garamond"/>
+            <w:color w:val="000000"/>
+            <w:shd w:fill="auto" w:val="clear"/>
+          </w:rPr>
+          <w:t>(1971)</w:t>
+        </w:r>
+      </w:hyperlink>
+      <w:r>
+        <w:rPr>
+          <w:rFonts w:ascii="Garamond" w:hAnsi="Garamond"/>
+          <w:color w:val="000000"/>
+          <w:shd w:fill="auto" w:val="clear"/>
+        </w:rPr>
+        <w:t xml:space="preserve">, e </w:t>
+      </w:r>
+      <w:r>
+        <w:rPr>
+          <w:rFonts w:ascii="Garamond" w:hAnsi="Garamond"/>
+          <w:color w:val="000000"/>
+          <w:shd w:fill="auto" w:val="clear"/>
+        </w:rPr>
+        <w:t>la critica ha parl</w:t>
+      </w:r>
+      <w:r>
+        <w:rPr>
+          <w:rFonts w:ascii="Garamond" w:hAnsi="Garamond"/>
+          <w:color w:val="000000"/>
+        </w:rPr>
+        <w:t>ato di distopia tecnologica, di eco-distopia, di libri ecologici</w:t>
       </w:r>
       <w:r>
         <w:rPr>
@@ -210,7 +222,24 @@
           <w:rFonts w:ascii="Garamond" w:hAnsi="Garamond"/>
           <w:color w:val="000000"/>
         </w:rPr>
-        <w:t xml:space="preserve">. In queste opere il rapporto tra individuo e ambiente si configura attraverso la costruzione letteraria di ecosistemi nei quali l’essere umano non occupa una posizione centrale, ma è soltanto uno degli elementi in gioco, privo di un’agency privilegiata rispetto agli altri attanti – animali, piante, oggetti, macchine. </w:t>
+        <w:t xml:space="preserve">. In queste opere il rapporto tra individuo e ambiente si configura attraverso la costruzione letteraria di ecosistemi nei quali l’essere umano non occupa una posizione centrale, ma è soltanto uno degli elementi in gioco, privo di un’agency privilegiata rispetto agli altri attanti – </w:t>
+      </w:r>
+      <w:hyperlink r:id="rId4">
+        <w:r>
+          <w:rPr>
+            <w:rStyle w:val="Hyperlink"/>
+            <w:rFonts w:ascii="Garamond" w:hAnsi="Garamond"/>
+            <w:color w:val="000000"/>
+          </w:rPr>
+          <w:t>animali, piante, oggetti, macchine</w:t>
+        </w:r>
+      </w:hyperlink>
+      <w:r>
+        <w:rPr>
+          <w:rFonts w:ascii="Garamond" w:hAnsi="Garamond"/>
+          <w:color w:val="000000"/>
+        </w:rPr>
+        <w:t xml:space="preserve">. </w:t>
       </w:r>
     </w:p>
     <w:p>
@@ -315,7 +344,7 @@
         </w:rPr>
         <w:t> </w:t>
       </w:r>
-      <w:hyperlink r:id="rId3">
+      <w:hyperlink r:id="rId5">
         <w:r>
           <w:rPr>
             <w:rStyle w:val="Hyperlink"/>
@@ -476,12 +505,42 @@
         <w:rPr>
           <w:rStyle w:val="Emphasis"/>
           <w:rFonts w:eastAsia="" w:ascii="Garamond" w:hAnsi="Garamond" w:eastAsiaTheme="majorEastAsia"/>
-          <w:b/>
-          <w:bCs/>
+          <w:b w:val="false"/>
+          <w:bCs w:val="false"/>
+          <w:i w:val="false"/>
+          <w:iCs w:val="false"/>
           <w:color w:val="000000"/>
           <w:shd w:fill="FFFF00" w:val="clear"/>
         </w:rPr>
-        <w:t>(Pieno impiego)</w:t>
+        <w:t>(</w:t>
+      </w:r>
+      <w:hyperlink r:id="rId6">
+        <w:r>
+          <w:rPr>
+            <w:rStyle w:val="Hyperlink"/>
+            <w:rFonts w:eastAsia="" w:ascii="Garamond" w:hAnsi="Garamond" w:eastAsiaTheme="majorEastAsia"/>
+            <w:b w:val="false"/>
+            <w:bCs w:val="false"/>
+            <w:i/>
+            <w:iCs/>
+            <w:color w:val="000000"/>
+            <w:shd w:fill="FFFF00" w:val="clear"/>
+          </w:rPr>
+          <w:t>Pieno impiego</w:t>
+        </w:r>
+      </w:hyperlink>
+      <w:r>
+        <w:rPr>
+          <w:rStyle w:val="Emphasis"/>
+          <w:rFonts w:eastAsia="" w:ascii="Garamond" w:hAnsi="Garamond" w:eastAsiaTheme="majorEastAsia"/>
+          <w:b w:val="false"/>
+          <w:bCs w:val="false"/>
+          <w:i w:val="false"/>
+          <w:iCs w:val="false"/>
+          <w:color w:val="000000"/>
+          <w:shd w:fill="FFFF00" w:val="clear"/>
+        </w:rPr>
+        <w:t>)</w:t>
       </w:r>
       <w:r>
         <w:rPr>
@@ -490,7 +549,7 @@
         </w:rPr>
         <w:t xml:space="preserve">, non sono accompagnati da descrizioni fisiche o psicologiche. Non vi è introspezione: ciò che conta non è la vita interiore, ma la funzione che il personaggio svolge all’interno dell’ecosistema narrativo. In questo contesto, l’antagonista può non essere una persona, ma un oggetto, o più spesso una macchina, che assume connotati di volta in volta diversi e sempre mostruosi. Il Mimete, il Calometro, il Versificatore sono dispositivi dotati di competenze sovrumane, quasi magiche, che intervengono nel mondo come veri e propri oggetti fiabeschi. Emblematico è il caso della </w:t>
       </w:r>
-      <w:hyperlink r:id="rId4">
+      <w:hyperlink r:id="rId7">
         <w:r>
           <w:rPr>
             <w:rStyle w:val="Hyperlink"/>
@@ -559,7 +618,7 @@
         </w:rPr>
         <w:t> </w:t>
       </w:r>
-      <w:hyperlink r:id="rId5">
+      <w:hyperlink r:id="rId8">
         <w:r>
           <w:rPr>
             <w:rStyle w:val="Hyperlink"/>
@@ -595,7 +654,7 @@
         </w:rPr>
         <w:t> </w:t>
       </w:r>
-      <w:hyperlink r:id="rId6">
+      <w:hyperlink r:id="rId9">
         <w:r>
           <w:rPr>
             <w:rStyle w:val="Hyperlink"/>
@@ -2673,8 +2732,8 @@
       <w:szCs w:val="20"/>
     </w:rPr>
   </w:style>
-  <w:style w:type="character" w:styleId="FootnoteCharacters">
-    <w:name w:val="Footnote Characters"/>
+  <w:style w:type="character" w:styleId="FootnoteCharactersuser">
+    <w:name w:val="Footnote Characters (user)"/>
     <w:uiPriority w:val="99"/>
     <w:semiHidden/>
     <w:unhideWhenUsed/>
@@ -2684,8 +2743,8 @@
       <w:vertAlign w:val="superscript"/>
     </w:rPr>
   </w:style>
-  <w:style w:type="character" w:styleId="FootnoteCharactersuser">
-    <w:name w:val="Footnote Characters (user)"/>
+  <w:style w:type="character" w:styleId="FootnoteCharacters">
+    <w:name w:val="Footnote Characters"/>
     <w:qFormat/>
     <w:rPr>
       <w:vertAlign w:val="superscript"/>
@@ -2697,15 +2756,15 @@
       <w:vertAlign w:val="superscript"/>
     </w:rPr>
   </w:style>
+  <w:style w:type="character" w:styleId="EndnoteCharacters">
+    <w:name w:val="Endnote Characters"/>
+    <w:qFormat/>
+    <w:rPr>
+      <w:vertAlign w:val="superscript"/>
+    </w:rPr>
+  </w:style>
   <w:style w:type="character" w:styleId="EndnoteCharactersuser">
     <w:name w:val="Endnote Characters (user)"/>
-    <w:qFormat/>
-    <w:rPr>
-      <w:vertAlign w:val="superscript"/>
-    </w:rPr>
-  </w:style>
-  <w:style w:type="character" w:styleId="EndnoteCharacters">
-    <w:name w:val="Endnote Characters"/>
     <w:qFormat/>
     <w:rPr/>
   </w:style>

</xml_diff>